<commit_message>
fix: exclude math intervals [0, 1] from citation regex
The add_text_para regex matched [0, 1] as a citation reference,
rendering it as 9pt superscript. Added _is_citation() check that
requires all numbers in brackets to be >= 1.

Co-Authored-By: Tatsuki Onishi <bougtoir@gmail.com>
</commit_message>
<xml_diff>
--- a/tasuki-electoral-model/output/docx/TATSUKI_Paper_English.docx
+++ b/tasuki-electoral-model/output/docx/TATSUKI_Paper_English.docx
@@ -694,10 +694,6 @@
         <w:t xml:space="preserve">At the end of each term, an independent evaluation body assesses the fulfillment degree fⱼ ∈ </w:t>
       </w:r>
       <w:r>
-        <w:rPr>
-          <w:sz w:val="18"/>
-          <w:vertAlign w:val="superscript"/>
-        </w:rPr>
         <w:t>[0, 1]</w:t>
       </w:r>
       <w:r>
@@ -764,10 +760,6 @@
         <w:t xml:space="preserve">The accountability score is transformed into a trust coefficient via the influence function ω: </w:t>
       </w:r>
       <w:r>
-        <w:rPr>
-          <w:sz w:val="18"/>
-          <w:vertAlign w:val="superscript"/>
-        </w:rPr>
         <w:t>[0, 1]</w:t>
       </w:r>
       <w:r>
@@ -928,10 +920,6 @@
         <w:t xml:space="preserve">To address the concern that exogenous events (natural disasters, global economic shocks, pandemics) may affect pledge fulfillability independently of candidate effort, TATSUKI incorporates an optional shock adjustment coefficient δ ∈ </w:t>
       </w:r>
       <w:r>
-        <w:rPr>
-          <w:sz w:val="18"/>
-          <w:vertAlign w:val="superscript"/>
-        </w:rPr>
         <w:t>[0, 1]</w:t>
       </w:r>
       <w:r>

</xml_diff>